<commit_message>
Sync to upstream w1-29 (SHA: 987d4a0951f6be99184032e2a58b57bb1b16eb53)
</commit_message>
<xml_diff>
--- a/Base Application/CRM/DefaultEmailMergeDoc.docx
+++ b/Base Application/CRM/DefaultEmailMergeDoc.docx
@@ -1817,105 +1817,96 @@
 </a:theme>
 </file>
 
-<file path=customXml/item1.xml>��< ? x m l   v e r s i o n = " 1 . 0 "   e n c o d i n g = " u t f - 1 6 " ? > - 
- < N a v W o r d R e p o r t X m l P a r t   x m l n s = " u r n : m i c r o s o f t - d y n a m i c s - n a v / r e p o r t s / E m a i l _ M e r g e / 5 0 8 4 / " > - 
-     < B C R e p o r t I n f o r m a t i o n > - 
-         < R e p o r t M e t a d a t a > - 
-             < E x t e n s i o n I d > E x t e n s i o n   I D < / E x t e n s i o n I d > - 
-             < E x t e n s i o n N a m e > E x t e n s i o n   N a m e < / E x t e n s i o n N a m e > - 
-             < E x t e n s i o n P u b l i s h e r > E x t e n s i o n   P u b l i s h e r < / E x t e n s i o n P u b l i s h e r > - 
-             < E x t e n s i o n V e r s i o n > E x t e n s i o n   V e r s i o n < / E x t e n s i o n V e r s i o n > - 
-             < R e p o r t I d > R e p o r t   I D < / R e p o r t I d > - 
-             < R e p o r t N a m e > R e p o r t   N a m e < / R e p o r t N a m e > - 
-             < A b o u t T h i s R e p o r t T i t l e > A b o u t   T h i s   R e p o r t   T i t l e < / A b o u t T h i s R e p o r t T i t l e > - 
-             < A b o u t T h i s R e p o r t T e x t > A b o u t   T h i s   R e p o r t   T e x t < / A b o u t T h i s R e p o r t T e x t > - 
-             < R e p o r t H e l p L i n k > R e p o r t   H e l p   L i n k < / R e p o r t H e l p L i n k > - 
-         < / R e p o r t M e t a d a t a > - 
-         < R e p o r t R e q u e s t > - 
-             < T e n a n t E n t r a I d > T e n a n t   E n t r a   I d < / T e n a n t E n t r a I d > - 
-             < E n v i r o n m e n t N a m e > E n v i r o n m e n t   N a m e < / E n v i r o n m e n t N a m e > - 
-             < E n v i r o n m e n t T y p e > E n v i r o n m e n t   T y p e < / E n v i r o n m e n t T y p e > - 
-             < C o m p a n y N a m e > C o m p a n y   N a m e < / C o m p a n y N a m e > - 
-             < C o m p a n y D i s p l a y N a m e > C o m p a n y   D i s p l a y   N a m e < / C o m p a n y D i s p l a y N a m e > - 
-             < C o m p a n y I d > C o m p a n y   I D < / C o m p a n y I d > - 
-             < U s e r N a m e > U s e r   N a m e < / U s e r N a m e > - 
-             < D a t e A n d T i m e > D a t e   a n d   T i m e < / D a t e A n d T i m e > - 
-             < L a n g u a g e > L a n g u a g e < / L a n g u a g e > - 
-             < F o r m a t R e g i o n > F o r m a t   R e g i o n < / F o r m a t R e g i o n > - 
-             < D a t e T i m e V a l u e s > - 
-                 < Y e a r > Y e a r < / Y e a r > - 
-                 < M o n t h N u m b e r > M o n t h   N u m b e r < / M o n t h N u m b e r > - 
-                 < D a y N u m b e r > D a y   N u m b e r < / D a y N u m b e r > - 
-                 < H o u r > H o u r < / H o u r > - 
-                 < M i n u t e > M i n u t e < / M i n u t e > - 
-             < / D a t e T i m e V a l u e s > - 
-         < / R e p o r t R e q u e s t > - 
-     < / B C R e p o r t I n f o r m a t i o n > - 
-     < I n t e g e r > - 
-         < C o m p a n y _ I n f o r m a t i o n _ A d d r e s s > C o m p a n y _ I n f o r m a t i o n _ A d d r e s s < / C o m p a n y _ I n f o r m a t i o n _ A d d r e s s > - 
-         < C o m p a n y _ I n f o r m a t i o n _ A d d r e s s _ 2 > C o m p a n y _ I n f o r m a t i o n _ A d d r e s s _ 2 < / C o m p a n y _ I n f o r m a t i o n _ A d d r e s s _ 2 > - 
-         < C o m p a n y _ I n f o r m a t i o n _ C i t y > C o m p a n y _ I n f o r m a t i o n _ C i t y < / C o m p a n y _ I n f o r m a t i o n _ C i t y > - 
-         < C o m p a n y _ I n f o r m a t i o n _ N a m e > C o m p a n y _ I n f o r m a t i o n _ N a m e < / C o m p a n y _ I n f o r m a t i o n _ N a m e > - 
-         < C o m p a n y _ I n f o r m a t i o n _ P i c t u r e   / > - 
-         < C o m p a n y _ I n f o r m a t i o n _ P o s t _ C o d e > C o m p a n y _ I n f o r m a t i o n _ P o s t _ C o d e < / C o m p a n y _ I n f o r m a t i o n _ P o s t _ C o d e > - 
-         < C o n t a c t _ M a i l _ A d d r e s s > C o n t a c t _ M a i l _ A d d r e s s < / C o n t a c t _ M a i l _ A d d r e s s > - 
-         < C o n t e n t > C o n t e n t < / C o n t e n t > - 
-         < D o c u m e n t _ D a t e > D o c u m e n t _ D a t e < / D o c u m e n t _ D a t e > - 
-         < F o r m a l _ S a l u t a t i o n > F o r m a l _ S a l u t a t i o n < / F o r m a l _ S a l u t a t i o n > - 
-         < I n f o r m a l _ S a l u t a t i o n > I n f o r m a l _ S a l u t a t i o n < / I n f o r m a l _ S a l u t a t i o n > - 
-         < S a l e s p e r s o n P u r c h a s e r _ J o b _ T i t l e > S a l e s p e r s o n P u r c h a s e r _ J o b _ T i t l e < / S a l e s p e r s o n P u r c h a s e r _ J o b _ T i t l e > - 
-         < S a l e s p e r s o n P u r c h a s e r _ N a m e > S a l e s p e r s o n P u r c h a s e r _ N a m e < / S a l e s p e r s o n P u r c h a s e r _ N a m e > - 
-     < / I n t e g e r > - 
- < / N a v W o r d R e p o r t X m l P a r t > 
+<file path=customXml/item1.xml><?xml version="1.0" encoding="utf-8"?>
+<NavWordReportXmlPart xmlns="urn:microsoft-dynamics-nav/reports/Email_Merge/5084/">
+  <BCReportInformation>
+    <ReportMetadata>
+      <ExtensionId>Extension ID</ExtensionId>
+      <ExtensionName>Extension Name</ExtensionName>
+      <ExtensionPublisher>Extension Publisher</ExtensionPublisher>
+      <ExtensionVersion>Extension Version</ExtensionVersion>
+      <ReportId>Report ID</ReportId>
+      <ReportName>Report Name</ReportName>
+      <AboutThisReportTitle>About This Report Title</AboutThisReportTitle>
+      <AboutThisReportText>About This Report Text</AboutThisReportText>
+      <ReportHelpLink>Report Help Link</ReportHelpLink>
+      <ReportCaption>Report Caption</ReportCaption>
+    </ReportMetadata>
+    <ReportRequest>
+      <TenantEntraId>Tenant Entra Id</TenantEntraId>
+      <EnvironmentName>Environment Name</EnvironmentName>
+      <EnvironmentType>Environment Type</EnvironmentType>
+      <CompanyName>Company Name</CompanyName>
+      <CompanyDisplayName>Company Display Name</CompanyDisplayName>
+      <CompanyId>Company ID</CompanyId>
+      <UserName>User Name</UserName>
+      <DateAndTime>Date and Time</DateAndTime>
+      <Language>Language</Language>
+      <FormatRegion>Format Region</FormatRegion>
+      <DateTimeValues>
+        <Year>Year</Year>
+        <MonthNumber>Month Number</MonthNumber>
+        <DayNumber>Day Number</DayNumber>
+        <Hour>Hour</Hour>
+        <Minute>Minute</Minute>
+      </DateTimeValues>
+    </ReportRequest>
+    <CompanyMetadata>
+      <CompanyName>Company Name</CompanyName>
+      <CompanyDisplayName>Company Display Name</CompanyDisplayName>
+      <CompanyAddressLines>
+        <CompanyAddressLine1>Company Address Line 1</CompanyAddressLine1>
+        <CompanyAddressLine2>Company Address Line 2</CompanyAddressLine2>
+        <CompanyAddressLine3>Company Address Line 3</CompanyAddressLine3>
+        <CompanyAddressLine4>Company Address Line 4</CompanyAddressLine4>
+        <CompanyAddressLine5>Company Address Line 5</CompanyAddressLine5>
+        <CompanyAddressLine6>Company Address Line 6</CompanyAddressLine6>
+        <CompanyAddressLine7>Company Address Line 7</CompanyAddressLine7>
+        <CompanyAddressLine8>Company Address Line 8</CompanyAddressLine8>
+      </CompanyAddressLines>
+      <CompanyPhone>Company Phone</CompanyPhone>
+      <CompanyPhoneCaption>Company Phone Caption</CompanyPhoneCaption>
+      <CompanyFaxNo>Company Fax No.</CompanyFaxNo>
+      <CompanyFaxNoCaption>Company Fax No. Caption</CompanyFaxNoCaption>
+      <CompanyEmail>Company Email</CompanyEmail>
+      <CompanyEmailCaption>Company Email Caption</CompanyEmailCaption>
+      <CompanyHomePage>Company Home Page</CompanyHomePage>
+      <CompanyHomePageCaption>Company Home Page Caption</CompanyHomePageCaption>
+      <CompanyLogo>Company Logo</CompanyLogo>
+      <CompanyVATRegistrationNo>Company VAT Registration No.</CompanyVATRegistrationNo>
+      <CompanyVATRegistrationNoCaption>Company VAT Registration No. Caption</CompanyVATRegistrationNoCaption>
+      <CompanyRegistrationNo>Company Registration No.</CompanyRegistrationNo>
+      <CompanyRegistrationNoCaption>Company Registration No. Caption</CompanyRegistrationNoCaption>
+      <CompanyBankName>Company Bank Name</CompanyBankName>
+      <CompanyBankNameCaption>Company Bank Name Caption</CompanyBankNameCaption>
+      <CompanyBankAccountNo>Company Bank Account No.</CompanyBankAccountNo>
+      <CompanyBankAccountNoCaption>Company Bank Account No. Caption</CompanyBankAccountNoCaption>
+      <CompanyBankBranchNo>Company Bank Branch No.</CompanyBankBranchNo>
+      <CompanyBankBranchNoCaption>Company Bank Branch No. Caption</CompanyBankBranchNoCaption>
+      <CompanyIBAN>Company IBAN</CompanyIBAN>
+      <CompanyIBANCaption>Company IBAN Caption</CompanyIBANCaption>
+      <CompanyBankSWIFT>Company Bank SWIFT</CompanyBankSWIFT>
+      <CompanyBankSWIFTCaption>Company Bank SWIFT Caption</CompanyBankSWIFTCaption>
+      <CompanyGiroNo>Company Giro No.</CompanyGiroNo>
+      <CompanyGiroNoCaption>Company Giro No. Caption</CompanyGiroNoCaption>
+    </CompanyMetadata>
+  </BCReportInformation>
+  <Integer>
+    <Company_Information_Address>Company_Information_Address</Company_Information_Address>
+    <Company_Information_Address_2>Company_Information_Address_2</Company_Information_Address_2>
+    <Company_Information_City>Company_Information_City</Company_Information_City>
+    <Company_Information_Name>Company_Information_Name</Company_Information_Name>
+    <Company_Information_Picture/>
+    <Company_Information_Post_Code>Company_Information_Post_Code</Company_Information_Post_Code>
+    <Contact_Mail_Address>Contact_Mail_Address</Contact_Mail_Address>
+    <Content>Content</Content>
+    <Document_Date>Document_Date</Document_Date>
+    <Formal_Salutation>Formal_Salutation</Formal_Salutation>
+    <Informal_Salutation>Informal_Salutation</Informal_Salutation>
+    <SalespersonPurchaser_Job_Title>SalespersonPurchaser_Job_Title</SalespersonPurchaser_Job_Title>
+    <SalespersonPurchaser_Name>SalespersonPurchaser_Name</SalespersonPurchaser_Name>
+  </Integer>
+</NavWordReportXmlPart>
 </file>
 
 <file path=customXml/itemProps1.xml><?xml version="1.0" encoding="utf-8"?>

</xml_diff>